<commit_message>
CAMBIOS AL REPORTE PARA NO MOSTRAR INFO
</commit_message>
<xml_diff>
--- a/Carta_de_liberación.docx
+++ b/Carta_de_liberación.docx
@@ -85,7 +85,13 @@
         <w:rPr>
           <w:rFonts w:ascii="Calibri" w:hAnsi="Calibri" w:cs="Arial"/>
         </w:rPr>
-        <w:t>20</w:t>
+        <w:t>2</w:t>
+      </w:r>
+      <w:r>
+        <w:rPr>
+          <w:rFonts w:ascii="Calibri" w:hAnsi="Calibri" w:cs="Arial"/>
+        </w:rPr>
+        <w:t>1</w:t>
       </w:r>
       <w:r>
         <w:rPr>

</xml_diff>